<commit_message>
CuivRézo : station 1.5, la mise en place du tube dans la cintreuse en gestes distincts (bras en l'air, crochet fixe, bras rabattu, trait sur L, R ou 0), cintreuse redessinée ; livrée depuis l'atelier 8aea80b
Co-Authored-By: Claude Opus 5.5 <noreply@anthropic.com>
</commit_message>
<xml_diff>
--- a/cuivrezo/papier/CuivRezo-fiches-de-poste-ELEVE.docx
+++ b/cuivrezo/papier/CuivRezo-fiches-de-poste-ELEVE.docx
@@ -6957,77 +6957,119 @@
                 <w:sz w:val="28"/>
                 <w:szCs w:val="28"/>
               </w:rPr>
-              <w:t xml:space="preserve">4. Ouvrir la cintreuse</w:t>
-            </w:r>
-          </w:p>
-          <w:p>
-            <w:pPr>
-              <w:spacing w:after="40"/>
-            </w:pPr>
-            <w:r>
-              <w:rPr>
-                <w:rFonts w:ascii="Calibri" w:cs="Calibri" w:eastAsia="Calibri" w:hAnsi="Calibri"/>
-                <w:color w:val="10233C"/>
-                <w:sz w:val="28"/>
-                <w:szCs w:val="28"/>
-              </w:rPr>
-              <w:t xml:space="preserve">5. Poser le trait sur L</w:t>
-            </w:r>
-          </w:p>
-          <w:p>
-            <w:pPr>
-              <w:spacing w:after="40"/>
-            </w:pPr>
-            <w:r>
-              <w:rPr>
-                <w:rFonts w:ascii="Calibri" w:cs="Calibri" w:eastAsia="Calibri" w:hAnsi="Calibri"/>
-                <w:color w:val="10233C"/>
-                <w:sz w:val="28"/>
-                <w:szCs w:val="28"/>
-              </w:rPr>
-              <w:t xml:space="preserve">6. Ou sur R, si la cote part de la droite</w:t>
-            </w:r>
-          </w:p>
-          <w:p>
-            <w:pPr>
-              <w:spacing w:after="40"/>
-            </w:pPr>
-            <w:r>
-              <w:rPr>
-                <w:rFonts w:ascii="Calibri" w:cs="Calibri" w:eastAsia="Calibri" w:hAnsi="Calibri"/>
-                <w:color w:val="10233C"/>
-                <w:sz w:val="28"/>
-                <w:szCs w:val="28"/>
-              </w:rPr>
-              <w:t xml:space="preserve">7. Ramener le bras</w:t>
-            </w:r>
-          </w:p>
-          <w:p>
-            <w:pPr>
-              <w:spacing w:after="40"/>
-            </w:pPr>
-            <w:r>
-              <w:rPr>
-                <w:rFonts w:ascii="Calibri" w:cs="Calibri" w:eastAsia="Calibri" w:hAnsi="Calibri"/>
-                <w:color w:val="10233C"/>
-                <w:sz w:val="28"/>
-                <w:szCs w:val="28"/>
-              </w:rPr>
-              <w:t xml:space="preserve">8. Arrêter quand le 0 est face au 90</w:t>
-            </w:r>
-          </w:p>
-          <w:p>
-            <w:pPr>
-              <w:spacing w:after="40"/>
-            </w:pPr>
-            <w:r>
-              <w:rPr>
-                <w:rFonts w:ascii="Calibri" w:cs="Calibri" w:eastAsia="Calibri" w:hAnsi="Calibri"/>
-                <w:color w:val="10233C"/>
-                <w:sz w:val="28"/>
-                <w:szCs w:val="28"/>
-              </w:rPr>
-              <w:t xml:space="preserve">9. Dégager, puis enchaîner</w:t>
+              <w:t xml:space="preserve">4. Lever le bras tournant</w:t>
+            </w:r>
+          </w:p>
+          <w:p>
+            <w:pPr>
+              <w:spacing w:after="40"/>
+            </w:pPr>
+            <w:r>
+              <w:rPr>
+                <w:rFonts w:ascii="Calibri" w:cs="Calibri" w:eastAsia="Calibri" w:hAnsi="Calibri"/>
+                <w:color w:val="10233C"/>
+                <w:sz w:val="28"/>
+                <w:szCs w:val="28"/>
+              </w:rPr>
+              <w:t xml:space="preserve">5. Engager le tube sous le crochet fixe</w:t>
+            </w:r>
+          </w:p>
+          <w:p>
+            <w:pPr>
+              <w:spacing w:after="40"/>
+            </w:pPr>
+            <w:r>
+              <w:rPr>
+                <w:rFonts w:ascii="Calibri" w:cs="Calibri" w:eastAsia="Calibri" w:hAnsi="Calibri"/>
+                <w:color w:val="10233C"/>
+                <w:sz w:val="28"/>
+                <w:szCs w:val="28"/>
+              </w:rPr>
+              <w:t xml:space="preserve">6. Rabattre le bras tournant</w:t>
+            </w:r>
+          </w:p>
+          <w:p>
+            <w:pPr>
+              <w:spacing w:after="40"/>
+            </w:pPr>
+            <w:r>
+              <w:rPr>
+                <w:rFonts w:ascii="Calibri" w:cs="Calibri" w:eastAsia="Calibri" w:hAnsi="Calibri"/>
+                <w:color w:val="10233C"/>
+                <w:sz w:val="28"/>
+                <w:szCs w:val="28"/>
+              </w:rPr>
+              <w:t xml:space="preserve">7. Amener le trait sur L</w:t>
+            </w:r>
+          </w:p>
+          <w:p>
+            <w:pPr>
+              <w:spacing w:after="40"/>
+            </w:pPr>
+            <w:r>
+              <w:rPr>
+                <w:rFonts w:ascii="Calibri" w:cs="Calibri" w:eastAsia="Calibri" w:hAnsi="Calibri"/>
+                <w:color w:val="10233C"/>
+                <w:sz w:val="28"/>
+                <w:szCs w:val="28"/>
+              </w:rPr>
+              <w:t xml:space="preserve">8. Ou sur R, si la cote part de la droite</w:t>
+            </w:r>
+          </w:p>
+          <w:p>
+            <w:pPr>
+              <w:spacing w:after="40"/>
+            </w:pPr>
+            <w:r>
+              <w:rPr>
+                <w:rFonts w:ascii="Calibri" w:cs="Calibri" w:eastAsia="Calibri" w:hAnsi="Calibri"/>
+                <w:color w:val="10233C"/>
+                <w:sz w:val="28"/>
+                <w:szCs w:val="28"/>
+              </w:rPr>
+              <w:t xml:space="preserve">9. Ou sur le 0, si vous avez retiré Rc</w:t>
+            </w:r>
+          </w:p>
+          <w:p>
+            <w:pPr>
+              <w:spacing w:after="40"/>
+            </w:pPr>
+            <w:r>
+              <w:rPr>
+                <w:rFonts w:ascii="Calibri" w:cs="Calibri" w:eastAsia="Calibri" w:hAnsi="Calibri"/>
+                <w:color w:val="10233C"/>
+                <w:sz w:val="28"/>
+                <w:szCs w:val="28"/>
+              </w:rPr>
+              <w:t xml:space="preserve">10. Ramener le bras</w:t>
+            </w:r>
+          </w:p>
+          <w:p>
+            <w:pPr>
+              <w:spacing w:after="40"/>
+            </w:pPr>
+            <w:r>
+              <w:rPr>
+                <w:rFonts w:ascii="Calibri" w:cs="Calibri" w:eastAsia="Calibri" w:hAnsi="Calibri"/>
+                <w:color w:val="10233C"/>
+                <w:sz w:val="28"/>
+                <w:szCs w:val="28"/>
+              </w:rPr>
+              <w:t xml:space="preserve">11. Arrêter quand le 0 est face au 90</w:t>
+            </w:r>
+          </w:p>
+          <w:p>
+            <w:pPr>
+              <w:spacing w:after="40"/>
+            </w:pPr>
+            <w:r>
+              <w:rPr>
+                <w:rFonts w:ascii="Calibri" w:cs="Calibri" w:eastAsia="Calibri" w:hAnsi="Calibri"/>
+                <w:color w:val="10233C"/>
+                <w:sz w:val="28"/>
+                <w:szCs w:val="28"/>
+              </w:rPr>
+              <w:t xml:space="preserve">12. Dégager, puis enchaîner</w:t>
             </w:r>
           </w:p>
         </w:tc>
@@ -7105,6 +7147,31 @@
                 <w:szCs w:val="28"/>
               </w:rPr>
               <w:t xml:space="preserve">Le mauvais repère</w:t>
+            </w:r>
+          </w:p>
+          <w:p>
+            <w:pPr>
+              <w:spacing w:after="40"/>
+            </w:pPr>
+            <w:r>
+              <w:rPr>
+                <w:rFonts w:ascii="Calibri" w:cs="Calibri" w:eastAsia="Calibri" w:hAnsi="Calibri"/>
+                <w:b/>
+                <w:bCs/>
+                <w:color w:val="B3261E"/>
+                <w:sz w:val="28"/>
+                <w:szCs w:val="28"/>
+              </w:rPr>
+              <w:t xml:space="preserve">✘  </w:t>
+            </w:r>
+            <w:r>
+              <w:rPr>
+                <w:rFonts w:ascii="Calibri" w:cs="Calibri" w:eastAsia="Calibri" w:hAnsi="Calibri"/>
+                <w:color w:val="10233C"/>
+                <w:sz w:val="28"/>
+                <w:szCs w:val="28"/>
+              </w:rPr>
+              <w:t xml:space="preserve">Le tube hors du crochet</w:t>
             </w:r>
           </w:p>
           <w:p>

</xml_diff>

<commit_message>
CuivRézo : livraison du 11/10 — station 4.1 « Le chapeau de gendarme » refaite (dix gestes, tableau du tube 1/4″ et de la cintreuse 9/16″, exemple de la planche du TP CAP, figures mesure/tableau/X/M-A-B/décalé, cintreuse « M au 45 ») ; papier régénéré ; invite « Commencer » du jeu de l'azote ; retour-accueil, animations et clés recalculés
Co-Authored-By: Claude Opus 5.5 <noreply@anthropic.com>
</commit_message>
<xml_diff>
--- a/cuivrezo/papier/CuivRezo-fiches-de-poste-ELEVE.docx
+++ b/cuivrezo/papier/CuivRezo-fiches-de-poste-ELEVE.docx
@@ -15564,53 +15564,53 @@
                 <w:sz w:val="30"/>
                 <w:szCs w:val="30"/>
               </w:rPr>
-              <w:t xml:space="preserve">La pièce à obtenir : Un contournement symétrique, branches alignées</w:t>
-            </w:r>
-          </w:p>
-          <w:p>
-            <w:pPr>
-              <w:spacing w:after="40"/>
-            </w:pPr>
-            <w:r>
-              <w:rPr>
-                <w:rFonts w:ascii="Calibri" w:cs="Calibri" w:eastAsia="Calibri" w:hAnsi="Calibri"/>
-                <w:color w:val="1B3A63"/>
-                <w:sz w:val="28"/>
-                <w:szCs w:val="28"/>
-              </w:rPr>
-              <w:t xml:space="preserve">☐  </w:t>
-            </w:r>
-            <w:r>
-              <w:rPr>
-                <w:rFonts w:ascii="Calibri" w:cs="Calibri" w:eastAsia="Calibri" w:hAnsi="Calibri"/>
-                <w:color w:val="10233C"/>
-                <w:sz w:val="28"/>
-                <w:szCs w:val="28"/>
-              </w:rPr>
-              <w:t xml:space="preserve">Hauteur H conforme au plan</w:t>
-            </w:r>
-          </w:p>
-          <w:p>
-            <w:pPr>
-              <w:spacing w:after="40"/>
-            </w:pPr>
-            <w:r>
-              <w:rPr>
-                <w:rFonts w:ascii="Calibri" w:cs="Calibri" w:eastAsia="Calibri" w:hAnsi="Calibri"/>
-                <w:color w:val="1B3A63"/>
-                <w:sz w:val="28"/>
-                <w:szCs w:val="28"/>
-              </w:rPr>
-              <w:t xml:space="preserve">☐  </w:t>
-            </w:r>
-            <w:r>
-              <w:rPr>
-                <w:rFonts w:ascii="Calibri" w:cs="Calibri" w:eastAsia="Calibri" w:hAnsi="Calibri"/>
-                <w:color w:val="10233C"/>
-                <w:sz w:val="28"/>
-                <w:szCs w:val="28"/>
-              </w:rPr>
-              <w:t xml:space="preserve">Les deux côtés du chapeau égaux</w:t>
+              <w:t xml:space="preserve">La pièce à obtenir : Passer par-dessus un tube, d’un seul morceau</w:t>
+            </w:r>
+          </w:p>
+          <w:p>
+            <w:pPr>
+              <w:spacing w:after="40"/>
+            </w:pPr>
+            <w:r>
+              <w:rPr>
+                <w:rFonts w:ascii="Calibri" w:cs="Calibri" w:eastAsia="Calibri" w:hAnsi="Calibri"/>
+                <w:color w:val="1B3A63"/>
+                <w:sz w:val="28"/>
+                <w:szCs w:val="28"/>
+              </w:rPr>
+              <w:t xml:space="preserve">☐  </w:t>
+            </w:r>
+            <w:r>
+              <w:rPr>
+                <w:rFonts w:ascii="Calibri" w:cs="Calibri" w:eastAsia="Calibri" w:hAnsi="Calibri"/>
+                <w:color w:val="10233C"/>
+                <w:sz w:val="28"/>
+                <w:szCs w:val="28"/>
+              </w:rPr>
+              <w:t xml:space="preserve">La hauteur H du tableau, d’axe à axe (± 2 mm)</w:t>
+            </w:r>
+          </w:p>
+          <w:p>
+            <w:pPr>
+              <w:spacing w:after="40"/>
+            </w:pPr>
+            <w:r>
+              <w:rPr>
+                <w:rFonts w:ascii="Calibri" w:cs="Calibri" w:eastAsia="Calibri" w:hAnsi="Calibri"/>
+                <w:color w:val="1B3A63"/>
+                <w:sz w:val="28"/>
+                <w:szCs w:val="28"/>
+              </w:rPr>
+              <w:t xml:space="preserve">☐  </w:t>
+            </w:r>
+            <w:r>
+              <w:rPr>
+                <w:rFonts w:ascii="Calibri" w:cs="Calibri" w:eastAsia="Calibri" w:hAnsi="Calibri"/>
+                <w:color w:val="10233C"/>
+                <w:sz w:val="28"/>
+                <w:szCs w:val="28"/>
+              </w:rPr>
+              <w:t xml:space="preserve">Le sommet centré au-dessus de l’obstacle (± 2 mm), 10 mm de jeu au moins</w:t>
             </w:r>
           </w:p>
           <w:p>
@@ -15656,7 +15656,7 @@
                 <w:sz w:val="28"/>
                 <w:szCs w:val="28"/>
               </w:rPr>
-              <w:t xml:space="preserve">Pièce plane, tube ni écrasé ni marqué (cotes à ± 2 mm)</w:t>
+              <w:t xml:space="preserve">Pièce plane, aucun coude écrasé</w:t>
             </w:r>
           </w:p>
         </w:tc>
@@ -15783,99 +15783,122 @@
                 <w:sz w:val="28"/>
                 <w:szCs w:val="28"/>
               </w:rPr>
-              <w:t xml:space="preserve">Le plan de la pièce</w:t>
-            </w:r>
-          </w:p>
-          <w:p>
-            <w:pPr>
-              <w:spacing w:after="40"/>
-            </w:pPr>
-            <w:r>
-              <w:rPr>
-                <w:rFonts w:ascii="Calibri" w:cs="Calibri" w:eastAsia="Calibri" w:hAnsi="Calibri"/>
-                <w:color w:val="1B3A63"/>
-                <w:sz w:val="28"/>
-                <w:szCs w:val="28"/>
-              </w:rPr>
-              <w:t xml:space="preserve">☐  </w:t>
-            </w:r>
-            <w:r>
-              <w:rPr>
-                <w:rFonts w:ascii="Calibri" w:cs="Calibri" w:eastAsia="Calibri" w:hAnsi="Calibri"/>
-                <w:color w:val="10233C"/>
-                <w:sz w:val="28"/>
-                <w:szCs w:val="28"/>
-              </w:rPr>
-              <w:t xml:space="preserve">La cintrette ou la cintreuse du tube</w:t>
-            </w:r>
-          </w:p>
-          <w:p>
-            <w:pPr>
-              <w:spacing w:after="40"/>
-            </w:pPr>
-            <w:r>
-              <w:rPr>
-                <w:rFonts w:ascii="Calibri" w:cs="Calibri" w:eastAsia="Calibri" w:hAnsi="Calibri"/>
-                <w:color w:val="1B3A63"/>
-                <w:sz w:val="28"/>
-                <w:szCs w:val="28"/>
-              </w:rPr>
-              <w:t xml:space="preserve">☐  </w:t>
-            </w:r>
-            <w:r>
-              <w:rPr>
-                <w:rFonts w:ascii="Calibri" w:cs="Calibri" w:eastAsia="Calibri" w:hAnsi="Calibri"/>
-                <w:color w:val="10233C"/>
-                <w:sz w:val="28"/>
-                <w:szCs w:val="28"/>
-              </w:rPr>
-              <w:t xml:space="preserve">Un tube recuit, coupé et ébavuré</w:t>
-            </w:r>
-          </w:p>
-          <w:p>
-            <w:pPr>
-              <w:spacing w:after="40"/>
-            </w:pPr>
-            <w:r>
-              <w:rPr>
-                <w:rFonts w:ascii="Calibri" w:cs="Calibri" w:eastAsia="Calibri" w:hAnsi="Calibri"/>
-                <w:color w:val="1B3A63"/>
-                <w:sz w:val="28"/>
-                <w:szCs w:val="28"/>
-              </w:rPr>
-              <w:t xml:space="preserve">☐  </w:t>
-            </w:r>
-            <w:r>
-              <w:rPr>
-                <w:rFonts w:ascii="Calibri" w:cs="Calibri" w:eastAsia="Calibri" w:hAnsi="Calibri"/>
-                <w:color w:val="10233C"/>
-                <w:sz w:val="28"/>
-                <w:szCs w:val="28"/>
-              </w:rPr>
-              <w:t xml:space="preserve">La règle, l’équerre, la fausse équerre</w:t>
-            </w:r>
-          </w:p>
-          <w:p>
-            <w:pPr>
-              <w:spacing w:after="40"/>
-            </w:pPr>
-            <w:r>
-              <w:rPr>
-                <w:rFonts w:ascii="Calibri" w:cs="Calibri" w:eastAsia="Calibri" w:hAnsi="Calibri"/>
-                <w:color w:val="1B3A63"/>
-                <w:sz w:val="28"/>
-                <w:szCs w:val="28"/>
-              </w:rPr>
-              <w:t xml:space="preserve">☐  </w:t>
-            </w:r>
-            <w:r>
-              <w:rPr>
-                <w:rFonts w:ascii="Calibri" w:cs="Calibri" w:eastAsia="Calibri" w:hAnsi="Calibri"/>
-                <w:color w:val="10233C"/>
-                <w:sz w:val="28"/>
-                <w:szCs w:val="28"/>
-              </w:rPr>
-              <w:t xml:space="preserve">Le feutre fin et le mètre</w:t>
+              <w:t xml:space="preserve">Le tableau du chapeau</w:t>
+            </w:r>
+          </w:p>
+          <w:p>
+            <w:pPr>
+              <w:spacing w:after="40"/>
+            </w:pPr>
+            <w:r>
+              <w:rPr>
+                <w:rFonts w:ascii="Calibri" w:cs="Calibri" w:eastAsia="Calibri" w:hAnsi="Calibri"/>
+                <w:color w:val="1B3A63"/>
+                <w:sz w:val="28"/>
+                <w:szCs w:val="28"/>
+              </w:rPr>
+              <w:t xml:space="preserve">☐  </w:t>
+            </w:r>
+            <w:r>
+              <w:rPr>
+                <w:rFonts w:ascii="Calibri" w:cs="Calibri" w:eastAsia="Calibri" w:hAnsi="Calibri"/>
+                <w:color w:val="10233C"/>
+                <w:sz w:val="28"/>
+                <w:szCs w:val="28"/>
+              </w:rPr>
+              <w:t xml:space="preserve">La cintreuse 1/4″</w:t>
+            </w:r>
+          </w:p>
+          <w:p>
+            <w:pPr>
+              <w:spacing w:after="40"/>
+            </w:pPr>
+            <w:r>
+              <w:rPr>
+                <w:rFonts w:ascii="Calibri" w:cs="Calibri" w:eastAsia="Calibri" w:hAnsi="Calibri"/>
+                <w:color w:val="1B3A63"/>
+                <w:sz w:val="28"/>
+                <w:szCs w:val="28"/>
+              </w:rPr>
+              <w:t xml:space="preserve">☐  </w:t>
+            </w:r>
+            <w:r>
+              <w:rPr>
+                <w:rFonts w:ascii="Calibri" w:cs="Calibri" w:eastAsia="Calibri" w:hAnsi="Calibri"/>
+                <w:color w:val="10233C"/>
+                <w:sz w:val="28"/>
+                <w:szCs w:val="28"/>
+              </w:rPr>
+              <w:t xml:space="preserve">Un tube 1/4″ recuit, coupé et ébavuré</w:t>
+            </w:r>
+          </w:p>
+          <w:p>
+            <w:pPr>
+              <w:spacing w:after="40"/>
+            </w:pPr>
+            <w:r>
+              <w:rPr>
+                <w:rFonts w:ascii="Calibri" w:cs="Calibri" w:eastAsia="Calibri" w:hAnsi="Calibri"/>
+                <w:color w:val="1B3A63"/>
+                <w:sz w:val="28"/>
+                <w:szCs w:val="28"/>
+              </w:rPr>
+              <w:t xml:space="preserve">☐  </w:t>
+            </w:r>
+            <w:r>
+              <w:rPr>
+                <w:rFonts w:ascii="Calibri" w:cs="Calibri" w:eastAsia="Calibri" w:hAnsi="Calibri"/>
+                <w:color w:val="10233C"/>
+                <w:sz w:val="28"/>
+                <w:szCs w:val="28"/>
+              </w:rPr>
+              <w:t xml:space="preserve">Le réglet ou le mètre, le feutre fin</w:t>
+            </w:r>
+          </w:p>
+          <w:p>
+            <w:pPr>
+              <w:spacing w:after="40"/>
+            </w:pPr>
+            <w:r>
+              <w:rPr>
+                <w:rFonts w:ascii="Calibri" w:cs="Calibri" w:eastAsia="Calibri" w:hAnsi="Calibri"/>
+                <w:color w:val="1B3A63"/>
+                <w:sz w:val="28"/>
+                <w:szCs w:val="28"/>
+              </w:rPr>
+              <w:t xml:space="preserve">☐  </w:t>
+            </w:r>
+            <w:r>
+              <w:rPr>
+                <w:rFonts w:ascii="Calibri" w:cs="Calibri" w:eastAsia="Calibri" w:hAnsi="Calibri"/>
+                <w:color w:val="10233C"/>
+                <w:sz w:val="28"/>
+                <w:szCs w:val="28"/>
+              </w:rPr>
+              <w:t xml:space="preserve">La règle et l’équerre</w:t>
+            </w:r>
+          </w:p>
+          <w:p>
+            <w:pPr>
+              <w:spacing w:after="40"/>
+            </w:pPr>
+            <w:r>
+              <w:rPr>
+                <w:rFonts w:ascii="Calibri" w:cs="Calibri" w:eastAsia="Calibri" w:hAnsi="Calibri"/>
+                <w:color w:val="1B3A63"/>
+                <w:sz w:val="28"/>
+                <w:szCs w:val="28"/>
+              </w:rPr>
+              <w:t xml:space="preserve">☐  </w:t>
+            </w:r>
+            <w:r>
+              <w:rPr>
+                <w:rFonts w:ascii="Calibri" w:cs="Calibri" w:eastAsia="Calibri" w:hAnsi="Calibri"/>
+                <w:color w:val="10233C"/>
+                <w:sz w:val="28"/>
+                <w:szCs w:val="28"/>
+              </w:rPr>
+              <w:t xml:space="preserve">Le gabarit à l’échelle 1, s’il est fourni</w:t>
             </w:r>
           </w:p>
           <w:p>
@@ -15905,91 +15928,133 @@
                 <w:sz w:val="28"/>
                 <w:szCs w:val="28"/>
               </w:rPr>
-              <w:t xml:space="preserve">1. Repérer l’axe du chapeau</w:t>
-            </w:r>
-          </w:p>
-          <w:p>
-            <w:pPr>
-              <w:spacing w:after="40"/>
-            </w:pPr>
-            <w:r>
-              <w:rPr>
-                <w:rFonts w:ascii="Calibri" w:cs="Calibri" w:eastAsia="Calibri" w:hAnsi="Calibri"/>
-                <w:color w:val="10233C"/>
-                <w:sz w:val="28"/>
-                <w:szCs w:val="28"/>
-              </w:rPr>
-              <w:t xml:space="preserve">2. Tracer A et B, à égale distance</w:t>
-            </w:r>
-          </w:p>
-          <w:p>
-            <w:pPr>
-              <w:spacing w:after="40"/>
-            </w:pPr>
-            <w:r>
-              <w:rPr>
-                <w:rFonts w:ascii="Calibri" w:cs="Calibri" w:eastAsia="Calibri" w:hAnsi="Calibri"/>
-                <w:color w:val="10233C"/>
-                <w:sz w:val="28"/>
-                <w:szCs w:val="28"/>
-              </w:rPr>
-              <w:t xml:space="preserve">3. Choisir l’angle central</w:t>
-            </w:r>
-          </w:p>
-          <w:p>
-            <w:pPr>
-              <w:spacing w:after="40"/>
-            </w:pPr>
-            <w:r>
-              <w:rPr>
-                <w:rFonts w:ascii="Calibri" w:cs="Calibri" w:eastAsia="Calibri" w:hAnsi="Calibri"/>
-                <w:color w:val="10233C"/>
-                <w:sz w:val="28"/>
-                <w:szCs w:val="28"/>
-              </w:rPr>
-              <w:t xml:space="preserve">4. Cintrer le coude central</w:t>
-            </w:r>
-          </w:p>
-          <w:p>
-            <w:pPr>
-              <w:spacing w:after="40"/>
-            </w:pPr>
-            <w:r>
-              <w:rPr>
-                <w:rFonts w:ascii="Calibri" w:cs="Calibri" w:eastAsia="Calibri" w:hAnsi="Calibri"/>
-                <w:color w:val="10233C"/>
-                <w:sz w:val="28"/>
-                <w:szCs w:val="28"/>
-              </w:rPr>
-              <w:t xml:space="preserve">5. Cintrer le coude A, à la moitié</w:t>
-            </w:r>
-          </w:p>
-          <w:p>
-            <w:pPr>
-              <w:spacing w:after="40"/>
-            </w:pPr>
-            <w:r>
-              <w:rPr>
-                <w:rFonts w:ascii="Calibri" w:cs="Calibri" w:eastAsia="Calibri" w:hAnsi="Calibri"/>
-                <w:color w:val="10233C"/>
-                <w:sz w:val="28"/>
-                <w:szCs w:val="28"/>
-              </w:rPr>
-              <w:t xml:space="preserve">6. Cintrer le coude B, pareil</w:t>
-            </w:r>
-          </w:p>
-          <w:p>
-            <w:pPr>
-              <w:spacing w:after="40"/>
-            </w:pPr>
-            <w:r>
-              <w:rPr>
-                <w:rFonts w:ascii="Calibri" w:cs="Calibri" w:eastAsia="Calibri" w:hAnsi="Calibri"/>
-                <w:color w:val="10233C"/>
-                <w:sz w:val="28"/>
-                <w:szCs w:val="28"/>
-              </w:rPr>
-              <w:t xml:space="preserve">7. Contrôler l’alignement à la règle</w:t>
+              <w:t xml:space="preserve">1. Mesurer le dépassement d</w:t>
+            </w:r>
+          </w:p>
+          <w:p>
+            <w:pPr>
+              <w:spacing w:after="40"/>
+            </w:pPr>
+            <w:r>
+              <w:rPr>
+                <w:rFonts w:ascii="Calibri" w:cs="Calibri" w:eastAsia="Calibri" w:hAnsi="Calibri"/>
+                <w:color w:val="10233C"/>
+                <w:sz w:val="28"/>
+                <w:szCs w:val="28"/>
+              </w:rPr>
+              <w:t xml:space="preserve">2. Lire la ligne du tableau</w:t>
+            </w:r>
+          </w:p>
+          <w:p>
+            <w:pPr>
+              <w:spacing w:after="40"/>
+            </w:pPr>
+            <w:r>
+              <w:rPr>
+                <w:rFonts w:ascii="Calibri" w:cs="Calibri" w:eastAsia="Calibri" w:hAnsi="Calibri"/>
+                <w:color w:val="10233C"/>
+                <w:sz w:val="28"/>
+                <w:szCs w:val="28"/>
+              </w:rPr>
+              <w:t xml:space="preserve">3. Tracer X au-dessus de l’obstacle</w:t>
+            </w:r>
+          </w:p>
+          <w:p>
+            <w:pPr>
+              <w:spacing w:after="40"/>
+            </w:pPr>
+            <w:r>
+              <w:rPr>
+                <w:rFonts w:ascii="Calibri" w:cs="Calibri" w:eastAsia="Calibri" w:hAnsi="Calibri"/>
+                <w:color w:val="10233C"/>
+                <w:sz w:val="28"/>
+                <w:szCs w:val="28"/>
+              </w:rPr>
+              <w:t xml:space="preserve">4. Tracer M, puis A et B</w:t>
+            </w:r>
+          </w:p>
+          <w:p>
+            <w:pPr>
+              <w:spacing w:after="40"/>
+            </w:pPr>
+            <w:r>
+              <w:rPr>
+                <w:rFonts w:ascii="Calibri" w:cs="Calibri" w:eastAsia="Calibri" w:hAnsi="Calibri"/>
+                <w:color w:val="10233C"/>
+                <w:sz w:val="28"/>
+                <w:szCs w:val="28"/>
+              </w:rPr>
+              <w:t xml:space="preserve">5. Placer le tube dans la cintreuse</w:t>
+            </w:r>
+          </w:p>
+          <w:p>
+            <w:pPr>
+              <w:spacing w:after="40"/>
+            </w:pPr>
+            <w:r>
+              <w:rPr>
+                <w:rFonts w:ascii="Calibri" w:cs="Calibri" w:eastAsia="Calibri" w:hAnsi="Calibri"/>
+                <w:color w:val="10233C"/>
+                <w:sz w:val="28"/>
+                <w:szCs w:val="28"/>
+              </w:rPr>
+              <w:t xml:space="preserve">6. Cintrer le sommet à 90°</w:t>
+            </w:r>
+          </w:p>
+          <w:p>
+            <w:pPr>
+              <w:spacing w:after="40"/>
+            </w:pPr>
+            <w:r>
+              <w:rPr>
+                <w:rFonts w:ascii="Calibri" w:cs="Calibri" w:eastAsia="Calibri" w:hAnsi="Calibri"/>
+                <w:color w:val="10233C"/>
+                <w:sz w:val="28"/>
+                <w:szCs w:val="28"/>
+              </w:rPr>
+              <w:t xml:space="preserve">7. Cintrer A à 45°, tube retourné</w:t>
+            </w:r>
+          </w:p>
+          <w:p>
+            <w:pPr>
+              <w:spacing w:after="40"/>
+            </w:pPr>
+            <w:r>
+              <w:rPr>
+                <w:rFonts w:ascii="Calibri" w:cs="Calibri" w:eastAsia="Calibri" w:hAnsi="Calibri"/>
+                <w:color w:val="10233C"/>
+                <w:sz w:val="28"/>
+                <w:szCs w:val="28"/>
+              </w:rPr>
+              <w:t xml:space="preserve">8. Cintrer B pareil</w:t>
+            </w:r>
+          </w:p>
+          <w:p>
+            <w:pPr>
+              <w:spacing w:after="40"/>
+            </w:pPr>
+            <w:r>
+              <w:rPr>
+                <w:rFonts w:ascii="Calibri" w:cs="Calibri" w:eastAsia="Calibri" w:hAnsi="Calibri"/>
+                <w:color w:val="10233C"/>
+                <w:sz w:val="28"/>
+                <w:szCs w:val="28"/>
+              </w:rPr>
+              <w:t xml:space="preserve">9. Présenter : le sommet centré</w:t>
+            </w:r>
+          </w:p>
+          <w:p>
+            <w:pPr>
+              <w:spacing w:after="40"/>
+            </w:pPr>
+            <w:r>
+              <w:rPr>
+                <w:rFonts w:ascii="Calibri" w:cs="Calibri" w:eastAsia="Calibri" w:hAnsi="Calibri"/>
+                <w:color w:val="10233C"/>
+                <w:sz w:val="28"/>
+                <w:szCs w:val="28"/>
+              </w:rPr>
+              <w:t xml:space="preserve">10. Contrôler à la règle et à l’équerre</w:t>
             </w:r>
           </w:p>
         </w:tc>
@@ -16041,32 +16106,57 @@
                 <w:sz w:val="28"/>
                 <w:szCs w:val="28"/>
               </w:rPr>
+              <w:t xml:space="preserve">M tracé sur X</w:t>
+            </w:r>
+          </w:p>
+          <w:p>
+            <w:pPr>
+              <w:spacing w:after="40"/>
+            </w:pPr>
+            <w:r>
+              <w:rPr>
+                <w:rFonts w:ascii="Calibri" w:cs="Calibri" w:eastAsia="Calibri" w:hAnsi="Calibri"/>
+                <w:b/>
+                <w:bCs/>
+                <w:color w:val="B3261E"/>
+                <w:sz w:val="28"/>
+                <w:szCs w:val="28"/>
+              </w:rPr>
+              <w:t xml:space="preserve">✘  </w:t>
+            </w:r>
+            <w:r>
+              <w:rPr>
+                <w:rFonts w:ascii="Calibri" w:cs="Calibri" w:eastAsia="Calibri" w:hAnsi="Calibri"/>
+                <w:color w:val="10233C"/>
+                <w:sz w:val="28"/>
+                <w:szCs w:val="28"/>
+              </w:rPr>
+              <w:t xml:space="preserve">La mauvaise ligne</w:t>
+            </w:r>
+          </w:p>
+          <w:p>
+            <w:pPr>
+              <w:spacing w:after="40"/>
+            </w:pPr>
+            <w:r>
+              <w:rPr>
+                <w:rFonts w:ascii="Calibri" w:cs="Calibri" w:eastAsia="Calibri" w:hAnsi="Calibri"/>
+                <w:b/>
+                <w:bCs/>
+                <w:color w:val="B3261E"/>
+                <w:sz w:val="28"/>
+                <w:szCs w:val="28"/>
+              </w:rPr>
+              <w:t xml:space="preserve">✘  </w:t>
+            </w:r>
+            <w:r>
+              <w:rPr>
+                <w:rFonts w:ascii="Calibri" w:cs="Calibri" w:eastAsia="Calibri" w:hAnsi="Calibri"/>
+                <w:color w:val="10233C"/>
+                <w:sz w:val="28"/>
+                <w:szCs w:val="28"/>
+              </w:rPr>
               <w:t xml:space="preserve">Les branches désaxées</w:t>
-            </w:r>
-          </w:p>
-          <w:p>
-            <w:pPr>
-              <w:spacing w:after="40"/>
-            </w:pPr>
-            <w:r>
-              <w:rPr>
-                <w:rFonts w:ascii="Calibri" w:cs="Calibri" w:eastAsia="Calibri" w:hAnsi="Calibri"/>
-                <w:b/>
-                <w:bCs/>
-                <w:color w:val="B3261E"/>
-                <w:sz w:val="28"/>
-                <w:szCs w:val="28"/>
-              </w:rPr>
-              <w:t xml:space="preserve">✘  </w:t>
-            </w:r>
-            <w:r>
-              <w:rPr>
-                <w:rFonts w:ascii="Calibri" w:cs="Calibri" w:eastAsia="Calibri" w:hAnsi="Calibri"/>
-                <w:color w:val="10233C"/>
-                <w:sz w:val="28"/>
-                <w:szCs w:val="28"/>
-              </w:rPr>
-              <w:t xml:space="preserve">La hauteur fausse</w:t>
             </w:r>
           </w:p>
           <w:p>
@@ -16178,30 +16268,30 @@
                 <w:sz w:val="28"/>
                 <w:szCs w:val="28"/>
               </w:rPr>
-              <w:t xml:space="preserve">La hauteur H est-elle celle du plan ?</w:t>
-            </w:r>
-          </w:p>
-          <w:p>
-            <w:pPr>
-              <w:spacing w:after="40"/>
-            </w:pPr>
-            <w:r>
-              <w:rPr>
-                <w:rFonts w:ascii="Calibri" w:cs="Calibri" w:eastAsia="Calibri" w:hAnsi="Calibri"/>
-                <w:color w:val="1B3A63"/>
-                <w:sz w:val="28"/>
-                <w:szCs w:val="28"/>
-              </w:rPr>
-              <w:t xml:space="preserve">☐  </w:t>
-            </w:r>
-            <w:r>
-              <w:rPr>
-                <w:rFonts w:ascii="Calibri" w:cs="Calibri" w:eastAsia="Calibri" w:hAnsi="Calibri"/>
-                <w:color w:val="10233C"/>
-                <w:sz w:val="28"/>
-                <w:szCs w:val="28"/>
-              </w:rPr>
-              <w:t xml:space="preserve">Les deux côtés sont-ils égaux ?</w:t>
+              <w:t xml:space="preserve">H est-elle celle du tableau ?</w:t>
+            </w:r>
+          </w:p>
+          <w:p>
+            <w:pPr>
+              <w:spacing w:after="40"/>
+            </w:pPr>
+            <w:r>
+              <w:rPr>
+                <w:rFonts w:ascii="Calibri" w:cs="Calibri" w:eastAsia="Calibri" w:hAnsi="Calibri"/>
+                <w:color w:val="1B3A63"/>
+                <w:sz w:val="28"/>
+                <w:szCs w:val="28"/>
+              </w:rPr>
+              <w:t xml:space="preserve">☐  </w:t>
+            </w:r>
+            <w:r>
+              <w:rPr>
+                <w:rFonts w:ascii="Calibri" w:cs="Calibri" w:eastAsia="Calibri" w:hAnsi="Calibri"/>
+                <w:color w:val="10233C"/>
+                <w:sz w:val="28"/>
+                <w:szCs w:val="28"/>
+              </w:rPr>
+              <w:t xml:space="preserve">Le sommet est-il centré, à 10 mm au moins de l’obstacle ?</w:t>
             </w:r>
           </w:p>
           <w:p>

</xml_diff>

<commit_message>
Le chapeau de gendarme, correction de faisabilité (Franck, 12/10) : le coude A se cintre cintreuse retournée (le sommet au crochet ; sinon le 90° bloque la cintreuse), son trait au bord du coude côté sommet (A 26 au lieu de 37) — station CuivRézo 4.1, film refait, TP inerWeb à télécharger, fiche Studio ; nouveauté « correction » du 12 octobre ; barre « retour à l'accueil » reposée sur CuivRézo ; clés recalculées
Co-Authored-By: Claude Opus 5.5 <noreply@anthropic.com>
</commit_message>
<xml_diff>
--- a/cuivrezo/papier/CuivRezo-fiches-de-poste-ELEVE.docx
+++ b/cuivrezo/papier/CuivRezo-fiches-de-poste-ELEVE.docx
@@ -15875,7 +15875,7 @@
                 <w:sz w:val="28"/>
                 <w:szCs w:val="28"/>
               </w:rPr>
-              <w:t xml:space="preserve">La règle et l’équerre</w:t>
+              <w:t xml:space="preserve">La règle</w:t>
             </w:r>
           </w:p>
           <w:p>
@@ -15956,35 +15956,35 @@
                 <w:sz w:val="28"/>
                 <w:szCs w:val="28"/>
               </w:rPr>
-              <w:t xml:space="preserve">3. Tracer X au-dessus de l’obstacle</w:t>
-            </w:r>
-          </w:p>
-          <w:p>
-            <w:pPr>
-              <w:spacing w:after="40"/>
-            </w:pPr>
-            <w:r>
-              <w:rPr>
-                <w:rFonts w:ascii="Calibri" w:cs="Calibri" w:eastAsia="Calibri" w:hAnsi="Calibri"/>
-                <w:color w:val="10233C"/>
-                <w:sz w:val="28"/>
-                <w:szCs w:val="28"/>
-              </w:rPr>
-              <w:t xml:space="preserve">4. Tracer M, puis A et B</w:t>
-            </w:r>
-          </w:p>
-          <w:p>
-            <w:pPr>
-              <w:spacing w:after="40"/>
-            </w:pPr>
-            <w:r>
-              <w:rPr>
-                <w:rFonts w:ascii="Calibri" w:cs="Calibri" w:eastAsia="Calibri" w:hAnsi="Calibri"/>
-                <w:color w:val="10233C"/>
-                <w:sz w:val="28"/>
-                <w:szCs w:val="28"/>
-              </w:rPr>
-              <w:t xml:space="preserve">5. Placer le tube dans la cintreuse</w:t>
+              <w:t xml:space="preserve">3. Mesurer et tracer X</w:t>
+            </w:r>
+          </w:p>
+          <w:p>
+            <w:pPr>
+              <w:spacing w:after="40"/>
+            </w:pPr>
+            <w:r>
+              <w:rPr>
+                <w:rFonts w:ascii="Calibri" w:cs="Calibri" w:eastAsia="Calibri" w:hAnsi="Calibri"/>
+                <w:color w:val="10233C"/>
+                <w:sz w:val="28"/>
+                <w:szCs w:val="28"/>
+              </w:rPr>
+              <w:t xml:space="preserve">4. Tracer A, S et B depuis X</w:t>
+            </w:r>
+          </w:p>
+          <w:p>
+            <w:pPr>
+              <w:spacing w:after="40"/>
+            </w:pPr>
+            <w:r>
+              <w:rPr>
+                <w:rFonts w:ascii="Calibri" w:cs="Calibri" w:eastAsia="Calibri" w:hAnsi="Calibri"/>
+                <w:color w:val="10233C"/>
+                <w:sz w:val="28"/>
+                <w:szCs w:val="28"/>
+              </w:rPr>
+              <w:t xml:space="preserve">5. Placer S sur le 0</w:t>
             </w:r>
           </w:p>
           <w:p>
@@ -16012,21 +16012,21 @@
                 <w:sz w:val="28"/>
                 <w:szCs w:val="28"/>
               </w:rPr>
-              <w:t xml:space="preserve">7. Cintrer A à 45°, tube retourné</w:t>
-            </w:r>
-          </w:p>
-          <w:p>
-            <w:pPr>
-              <w:spacing w:after="40"/>
-            </w:pPr>
-            <w:r>
-              <w:rPr>
-                <w:rFonts w:ascii="Calibri" w:cs="Calibri" w:eastAsia="Calibri" w:hAnsi="Calibri"/>
-                <w:color w:val="10233C"/>
-                <w:sz w:val="28"/>
-                <w:szCs w:val="28"/>
-              </w:rPr>
-              <w:t xml:space="preserve">8. Cintrer B pareil</w:t>
+              <w:t xml:space="preserve">7. Cintrer A à 45°, cintreuse retournée</w:t>
+            </w:r>
+          </w:p>
+          <w:p>
+            <w:pPr>
+              <w:spacing w:after="40"/>
+            </w:pPr>
+            <w:r>
+              <w:rPr>
+                <w:rFonts w:ascii="Calibri" w:cs="Calibri" w:eastAsia="Calibri" w:hAnsi="Calibri"/>
+                <w:color w:val="10233C"/>
+                <w:sz w:val="28"/>
+                <w:szCs w:val="28"/>
+              </w:rPr>
+              <w:t xml:space="preserve">8. Cintrer B à 45°, tube retourné</w:t>
             </w:r>
           </w:p>
           <w:p>
@@ -16054,7 +16054,7 @@
                 <w:sz w:val="28"/>
                 <w:szCs w:val="28"/>
               </w:rPr>
-              <w:t xml:space="preserve">10. Contrôler à la règle et à l’équerre</w:t>
+              <w:t xml:space="preserve">10. Contrôler à la règle et au réglet</w:t>
             </w:r>
           </w:p>
         </w:tc>
@@ -16106,7 +16106,7 @@
                 <w:sz w:val="28"/>
                 <w:szCs w:val="28"/>
               </w:rPr>
-              <w:t xml:space="preserve">M tracé sur X</w:t>
+              <w:t xml:space="preserve">Le chapeau décalé</w:t>
             </w:r>
           </w:p>
           <w:p>

</xml_diff>